<commit_message>
feat: homeView Anfang HTML/CSS
Angefangen homeView zu bauen. Leitplan ist das Mockup

Bis Jetzt nur 2 Buttons im Obersten Viertel.

Luka V
</commit_message>
<xml_diff>
--- a/Dokumentation/Projektplanung LV, ZB, KH.docx
+++ b/Dokumentation/Projektplanung LV, ZB, KH.docx
@@ -18,7 +18,27 @@
           <w:sz w:val="28"/>
           <w:szCs w:val="28"/>
         </w:rPr>
-        <w:t xml:space="preserve">Projektplanung Voyagediary </w:t>
+        <w:t xml:space="preserve">Projektplanung </w:t>
+      </w:r>
+      <w:proofErr w:type="spellStart"/>
+      <w:r>
+        <w:rPr>
+          <w:b/>
+          <w:bCs/>
+          <w:sz w:val="28"/>
+          <w:szCs w:val="28"/>
+        </w:rPr>
+        <w:t>Voyagediary</w:t>
+      </w:r>
+      <w:proofErr w:type="spellEnd"/>
+      <w:r>
+        <w:rPr>
+          <w:b/>
+          <w:bCs/>
+          <w:sz w:val="28"/>
+          <w:szCs w:val="28"/>
+        </w:rPr>
+        <w:t xml:space="preserve"> </w:t>
       </w:r>
     </w:p>
     <w:p>
@@ -57,17 +77,46 @@
       <w:r>
         <w:t xml:space="preserve">Die </w:t>
       </w:r>
+      <w:proofErr w:type="spellStart"/>
       <w:r>
-        <w:t>Social Media Plattform</w:t>
+        <w:t>Social</w:t>
+      </w:r>
+      <w:proofErr w:type="spellEnd"/>
+      <w:r>
+        <w:t xml:space="preserve"> Media Plattform</w:t>
       </w:r>
       <w:r>
-        <w:t xml:space="preserve"> «Voyagediary» </w:t>
+        <w:t xml:space="preserve"> «</w:t>
+      </w:r>
+      <w:proofErr w:type="spellStart"/>
+      <w:r>
+        <w:t>Voyagediary</w:t>
+      </w:r>
+      <w:proofErr w:type="spellEnd"/>
+      <w:r>
+        <w:t xml:space="preserve">» </w:t>
       </w:r>
       <w:r>
-        <w:t xml:space="preserve">soll eine Seite werden für Reiseinterresierte, auch bekannt als «Nomaden», </w:t>
+        <w:t xml:space="preserve">soll eine Seite werden für </w:t>
+      </w:r>
+      <w:proofErr w:type="spellStart"/>
+      <w:r>
+        <w:t>Reiseinterresierte</w:t>
+      </w:r>
+      <w:proofErr w:type="spellEnd"/>
+      <w:r>
+        <w:t xml:space="preserve">, auch bekannt als «Nomaden», </w:t>
       </w:r>
       <w:r>
-        <w:t>über deren Reise berichten können und von deren anderer Betrachten und sich informieren können.</w:t>
+        <w:t xml:space="preserve">über deren Reise berichten können und von deren </w:t>
+      </w:r>
+      <w:proofErr w:type="gramStart"/>
+      <w:r>
+        <w:t>anderer Betrachten</w:t>
+      </w:r>
+      <w:proofErr w:type="gramEnd"/>
+      <w:r>
+        <w:t xml:space="preserve"> und sich informieren können.</w:t>
       </w:r>
     </w:p>
     <w:p/>
@@ -985,8 +1034,22 @@
                 <w:lang w:eastAsia="de-CH"/>
                 <w14:ligatures w14:val="none"/>
               </w:rPr>
-              <w:t>ERM und ERD + Github</w:t>
-            </w:r>
+              <w:t xml:space="preserve">ERM und ERD + </w:t>
+            </w:r>
+            <w:proofErr w:type="spellStart"/>
+            <w:r>
+              <w:rPr>
+                <w:rFonts w:ascii="Calibri" w:eastAsia="Times New Roman" w:hAnsi="Calibri" w:cs="Calibri"/>
+                <w:color w:val="000000"/>
+                <w:kern w:val="0"/>
+                <w:sz w:val="22"/>
+                <w:szCs w:val="22"/>
+                <w:lang w:eastAsia="de-CH"/>
+                <w14:ligatures w14:val="none"/>
+              </w:rPr>
+              <w:t>Github</w:t>
+            </w:r>
+            <w:proofErr w:type="spellEnd"/>
           </w:p>
         </w:tc>
         <w:tc>
@@ -1131,17 +1194,31 @@
                 <w14:ligatures w14:val="none"/>
               </w:rPr>
             </w:pPr>
-            <w:r>
-              <w:rPr>
-                <w:rFonts w:ascii="Calibri" w:eastAsia="Times New Roman" w:hAnsi="Calibri" w:cs="Calibri"/>
-                <w:color w:val="000000"/>
-                <w:kern w:val="0"/>
-                <w:sz w:val="22"/>
-                <w:szCs w:val="22"/>
-                <w:lang w:eastAsia="de-CH"/>
-                <w14:ligatures w14:val="none"/>
-              </w:rPr>
-              <w:t>Informiten und Testen</w:t>
+            <w:proofErr w:type="spellStart"/>
+            <w:r>
+              <w:rPr>
+                <w:rFonts w:ascii="Calibri" w:eastAsia="Times New Roman" w:hAnsi="Calibri" w:cs="Calibri"/>
+                <w:color w:val="000000"/>
+                <w:kern w:val="0"/>
+                <w:sz w:val="22"/>
+                <w:szCs w:val="22"/>
+                <w:lang w:eastAsia="de-CH"/>
+                <w14:ligatures w14:val="none"/>
+              </w:rPr>
+              <w:t>Informiten</w:t>
+            </w:r>
+            <w:proofErr w:type="spellEnd"/>
+            <w:r>
+              <w:rPr>
+                <w:rFonts w:ascii="Calibri" w:eastAsia="Times New Roman" w:hAnsi="Calibri" w:cs="Calibri"/>
+                <w:color w:val="000000"/>
+                <w:kern w:val="0"/>
+                <w:sz w:val="22"/>
+                <w:szCs w:val="22"/>
+                <w:lang w:eastAsia="de-CH"/>
+                <w14:ligatures w14:val="none"/>
+              </w:rPr>
+              <w:t xml:space="preserve"> und Testen</w:t>
             </w:r>
           </w:p>
         </w:tc>
@@ -1265,7 +1342,33 @@
                 <w:lang w:eastAsia="de-CH"/>
                 <w14:ligatures w14:val="none"/>
               </w:rPr>
-              <w:t>Create Tabels und Docker Container</w:t>
+              <w:t xml:space="preserve">Create </w:t>
+            </w:r>
+            <w:proofErr w:type="spellStart"/>
+            <w:r>
+              <w:rPr>
+                <w:rFonts w:ascii="Calibri" w:eastAsia="Times New Roman" w:hAnsi="Calibri" w:cs="Calibri"/>
+                <w:color w:val="000000"/>
+                <w:kern w:val="0"/>
+                <w:sz w:val="22"/>
+                <w:szCs w:val="22"/>
+                <w:lang w:eastAsia="de-CH"/>
+                <w14:ligatures w14:val="none"/>
+              </w:rPr>
+              <w:t>Tabels</w:t>
+            </w:r>
+            <w:proofErr w:type="spellEnd"/>
+            <w:r>
+              <w:rPr>
+                <w:rFonts w:ascii="Calibri" w:eastAsia="Times New Roman" w:hAnsi="Calibri" w:cs="Calibri"/>
+                <w:color w:val="000000"/>
+                <w:kern w:val="0"/>
+                <w:sz w:val="22"/>
+                <w:szCs w:val="22"/>
+                <w:lang w:eastAsia="de-CH"/>
+                <w14:ligatures w14:val="none"/>
+              </w:rPr>
+              <w:t xml:space="preserve"> und Docker Container</w:t>
             </w:r>
           </w:p>
         </w:tc>
@@ -1411,17 +1514,57 @@
                 <w14:ligatures w14:val="none"/>
               </w:rPr>
             </w:pPr>
-            <w:r>
-              <w:rPr>
-                <w:rFonts w:ascii="Calibri" w:eastAsia="Times New Roman" w:hAnsi="Calibri" w:cs="Calibri"/>
-                <w:color w:val="000000"/>
-                <w:kern w:val="0"/>
-                <w:sz w:val="22"/>
-                <w:szCs w:val="22"/>
-                <w:lang w:eastAsia="de-CH"/>
-                <w14:ligatures w14:val="none"/>
-              </w:rPr>
-              <w:t xml:space="preserve">Übersezung für Start Seite implementiren </w:t>
+            <w:proofErr w:type="spellStart"/>
+            <w:r>
+              <w:rPr>
+                <w:rFonts w:ascii="Calibri" w:eastAsia="Times New Roman" w:hAnsi="Calibri" w:cs="Calibri"/>
+                <w:color w:val="000000"/>
+                <w:kern w:val="0"/>
+                <w:sz w:val="22"/>
+                <w:szCs w:val="22"/>
+                <w:lang w:eastAsia="de-CH"/>
+                <w14:ligatures w14:val="none"/>
+              </w:rPr>
+              <w:t>Übersezung</w:t>
+            </w:r>
+            <w:proofErr w:type="spellEnd"/>
+            <w:r>
+              <w:rPr>
+                <w:rFonts w:ascii="Calibri" w:eastAsia="Times New Roman" w:hAnsi="Calibri" w:cs="Calibri"/>
+                <w:color w:val="000000"/>
+                <w:kern w:val="0"/>
+                <w:sz w:val="22"/>
+                <w:szCs w:val="22"/>
+                <w:lang w:eastAsia="de-CH"/>
+                <w14:ligatures w14:val="none"/>
+              </w:rPr>
+              <w:t xml:space="preserve"> für Start Seite </w:t>
+            </w:r>
+            <w:proofErr w:type="spellStart"/>
+            <w:r>
+              <w:rPr>
+                <w:rFonts w:ascii="Calibri" w:eastAsia="Times New Roman" w:hAnsi="Calibri" w:cs="Calibri"/>
+                <w:color w:val="000000"/>
+                <w:kern w:val="0"/>
+                <w:sz w:val="22"/>
+                <w:szCs w:val="22"/>
+                <w:lang w:eastAsia="de-CH"/>
+                <w14:ligatures w14:val="none"/>
+              </w:rPr>
+              <w:t>implementiren</w:t>
+            </w:r>
+            <w:proofErr w:type="spellEnd"/>
+            <w:r>
+              <w:rPr>
+                <w:rFonts w:ascii="Calibri" w:eastAsia="Times New Roman" w:hAnsi="Calibri" w:cs="Calibri"/>
+                <w:color w:val="000000"/>
+                <w:kern w:val="0"/>
+                <w:sz w:val="22"/>
+                <w:szCs w:val="22"/>
+                <w:lang w:eastAsia="de-CH"/>
+                <w14:ligatures w14:val="none"/>
+              </w:rPr>
+              <w:t xml:space="preserve"> </w:t>
             </w:r>
           </w:p>
         </w:tc>
@@ -1535,17 +1678,83 @@
                 <w14:ligatures w14:val="none"/>
               </w:rPr>
             </w:pPr>
-            <w:r>
-              <w:rPr>
-                <w:rFonts w:ascii="Calibri" w:eastAsia="Times New Roman" w:hAnsi="Calibri" w:cs="Calibri"/>
-                <w:color w:val="000000"/>
-                <w:kern w:val="0"/>
-                <w:sz w:val="22"/>
-                <w:szCs w:val="22"/>
-                <w:lang w:eastAsia="de-CH"/>
-                <w14:ligatures w14:val="none"/>
-              </w:rPr>
-              <w:t xml:space="preserve">evt. User define functions oder </w:t>
+            <w:proofErr w:type="spellStart"/>
+            <w:r>
+              <w:rPr>
+                <w:rFonts w:ascii="Calibri" w:eastAsia="Times New Roman" w:hAnsi="Calibri" w:cs="Calibri"/>
+                <w:color w:val="000000"/>
+                <w:kern w:val="0"/>
+                <w:sz w:val="22"/>
+                <w:szCs w:val="22"/>
+                <w:lang w:eastAsia="de-CH"/>
+                <w14:ligatures w14:val="none"/>
+              </w:rPr>
+              <w:t>evt.</w:t>
+            </w:r>
+            <w:proofErr w:type="spellEnd"/>
+            <w:r>
+              <w:rPr>
+                <w:rFonts w:ascii="Calibri" w:eastAsia="Times New Roman" w:hAnsi="Calibri" w:cs="Calibri"/>
+                <w:color w:val="000000"/>
+                <w:kern w:val="0"/>
+                <w:sz w:val="22"/>
+                <w:szCs w:val="22"/>
+                <w:lang w:eastAsia="de-CH"/>
+                <w14:ligatures w14:val="none"/>
+              </w:rPr>
+              <w:t xml:space="preserve"> User </w:t>
+            </w:r>
+            <w:proofErr w:type="spellStart"/>
+            <w:r>
+              <w:rPr>
+                <w:rFonts w:ascii="Calibri" w:eastAsia="Times New Roman" w:hAnsi="Calibri" w:cs="Calibri"/>
+                <w:color w:val="000000"/>
+                <w:kern w:val="0"/>
+                <w:sz w:val="22"/>
+                <w:szCs w:val="22"/>
+                <w:lang w:eastAsia="de-CH"/>
+                <w14:ligatures w14:val="none"/>
+              </w:rPr>
+              <w:t>define</w:t>
+            </w:r>
+            <w:proofErr w:type="spellEnd"/>
+            <w:r>
+              <w:rPr>
+                <w:rFonts w:ascii="Calibri" w:eastAsia="Times New Roman" w:hAnsi="Calibri" w:cs="Calibri"/>
+                <w:color w:val="000000"/>
+                <w:kern w:val="0"/>
+                <w:sz w:val="22"/>
+                <w:szCs w:val="22"/>
+                <w:lang w:eastAsia="de-CH"/>
+                <w14:ligatures w14:val="none"/>
+              </w:rPr>
+              <w:t xml:space="preserve"> </w:t>
+            </w:r>
+            <w:proofErr w:type="spellStart"/>
+            <w:r>
+              <w:rPr>
+                <w:rFonts w:ascii="Calibri" w:eastAsia="Times New Roman" w:hAnsi="Calibri" w:cs="Calibri"/>
+                <w:color w:val="000000"/>
+                <w:kern w:val="0"/>
+                <w:sz w:val="22"/>
+                <w:szCs w:val="22"/>
+                <w:lang w:eastAsia="de-CH"/>
+                <w14:ligatures w14:val="none"/>
+              </w:rPr>
+              <w:t>functions</w:t>
+            </w:r>
+            <w:proofErr w:type="spellEnd"/>
+            <w:r>
+              <w:rPr>
+                <w:rFonts w:ascii="Calibri" w:eastAsia="Times New Roman" w:hAnsi="Calibri" w:cs="Calibri"/>
+                <w:color w:val="000000"/>
+                <w:kern w:val="0"/>
+                <w:sz w:val="22"/>
+                <w:szCs w:val="22"/>
+                <w:lang w:eastAsia="de-CH"/>
+                <w14:ligatures w14:val="none"/>
+              </w:rPr>
+              <w:t xml:space="preserve"> oder </w:t>
             </w:r>
           </w:p>
         </w:tc>
@@ -1623,8 +1832,22 @@
                 <w:lang w:eastAsia="de-CH"/>
                 <w14:ligatures w14:val="none"/>
               </w:rPr>
-              <w:t>Login/out , Profil, beitrag</w:t>
-            </w:r>
+              <w:t xml:space="preserve">Login/out , Profil, </w:t>
+            </w:r>
+            <w:proofErr w:type="spellStart"/>
+            <w:r>
+              <w:rPr>
+                <w:rFonts w:ascii="Calibri" w:eastAsia="Times New Roman" w:hAnsi="Calibri" w:cs="Calibri"/>
+                <w:color w:val="000000"/>
+                <w:kern w:val="0"/>
+                <w:sz w:val="22"/>
+                <w:szCs w:val="22"/>
+                <w:lang w:eastAsia="de-CH"/>
+                <w14:ligatures w14:val="none"/>
+              </w:rPr>
+              <w:t>beitrag</w:t>
+            </w:r>
+            <w:proofErr w:type="spellEnd"/>
           </w:p>
         </w:tc>
         <w:tc>
@@ -1691,18 +1914,46 @@
                 <w14:ligatures w14:val="none"/>
               </w:rPr>
             </w:pPr>
-            <w:r>
-              <w:rPr>
-                <w:rFonts w:ascii="Calibri" w:eastAsia="Times New Roman" w:hAnsi="Calibri" w:cs="Calibri"/>
-                <w:color w:val="000000"/>
-                <w:kern w:val="0"/>
-                <w:sz w:val="22"/>
-                <w:szCs w:val="22"/>
-                <w:lang w:eastAsia="de-CH"/>
-                <w14:ligatures w14:val="none"/>
-              </w:rPr>
-              <w:t>Js Logik login</w:t>
-            </w:r>
+            <w:proofErr w:type="spellStart"/>
+            <w:r>
+              <w:rPr>
+                <w:rFonts w:ascii="Calibri" w:eastAsia="Times New Roman" w:hAnsi="Calibri" w:cs="Calibri"/>
+                <w:color w:val="000000"/>
+                <w:kern w:val="0"/>
+                <w:sz w:val="22"/>
+                <w:szCs w:val="22"/>
+                <w:lang w:eastAsia="de-CH"/>
+                <w14:ligatures w14:val="none"/>
+              </w:rPr>
+              <w:t>Js</w:t>
+            </w:r>
+            <w:proofErr w:type="spellEnd"/>
+            <w:r>
+              <w:rPr>
+                <w:rFonts w:ascii="Calibri" w:eastAsia="Times New Roman" w:hAnsi="Calibri" w:cs="Calibri"/>
+                <w:color w:val="000000"/>
+                <w:kern w:val="0"/>
+                <w:sz w:val="22"/>
+                <w:szCs w:val="22"/>
+                <w:lang w:eastAsia="de-CH"/>
+                <w14:ligatures w14:val="none"/>
+              </w:rPr>
+              <w:t xml:space="preserve"> Logik </w:t>
+            </w:r>
+            <w:proofErr w:type="spellStart"/>
+            <w:r>
+              <w:rPr>
+                <w:rFonts w:ascii="Calibri" w:eastAsia="Times New Roman" w:hAnsi="Calibri" w:cs="Calibri"/>
+                <w:color w:val="000000"/>
+                <w:kern w:val="0"/>
+                <w:sz w:val="22"/>
+                <w:szCs w:val="22"/>
+                <w:lang w:eastAsia="de-CH"/>
+                <w14:ligatures w14:val="none"/>
+              </w:rPr>
+              <w:t>login</w:t>
+            </w:r>
+            <w:proofErr w:type="spellEnd"/>
           </w:p>
         </w:tc>
         <w:tc>
@@ -2811,17 +3062,31 @@
                 <w14:ligatures w14:val="none"/>
               </w:rPr>
             </w:pPr>
-            <w:r>
-              <w:rPr>
-                <w:rFonts w:ascii="Calibri" w:eastAsia="Times New Roman" w:hAnsi="Calibri" w:cs="Calibri"/>
-                <w:color w:val="000000"/>
-                <w:kern w:val="0"/>
-                <w:sz w:val="22"/>
-                <w:szCs w:val="22"/>
-                <w:lang w:eastAsia="de-CH"/>
-                <w14:ligatures w14:val="none"/>
-              </w:rPr>
-              <w:t>Js Logik Filter, suchleiste, etc.</w:t>
+            <w:proofErr w:type="spellStart"/>
+            <w:r>
+              <w:rPr>
+                <w:rFonts w:ascii="Calibri" w:eastAsia="Times New Roman" w:hAnsi="Calibri" w:cs="Calibri"/>
+                <w:color w:val="000000"/>
+                <w:kern w:val="0"/>
+                <w:sz w:val="22"/>
+                <w:szCs w:val="22"/>
+                <w:lang w:eastAsia="de-CH"/>
+                <w14:ligatures w14:val="none"/>
+              </w:rPr>
+              <w:t>Js</w:t>
+            </w:r>
+            <w:proofErr w:type="spellEnd"/>
+            <w:r>
+              <w:rPr>
+                <w:rFonts w:ascii="Calibri" w:eastAsia="Times New Roman" w:hAnsi="Calibri" w:cs="Calibri"/>
+                <w:color w:val="000000"/>
+                <w:kern w:val="0"/>
+                <w:sz w:val="22"/>
+                <w:szCs w:val="22"/>
+                <w:lang w:eastAsia="de-CH"/>
+                <w14:ligatures w14:val="none"/>
+              </w:rPr>
+              <w:t xml:space="preserve"> Logik Filter, suchleiste, etc.</w:t>
             </w:r>
           </w:p>
         </w:tc>
@@ -4079,6 +4344,7 @@
                 <w14:ligatures w14:val="none"/>
               </w:rPr>
             </w:pPr>
+            <w:proofErr w:type="spellStart"/>
             <w:r>
               <w:rPr>
                 <w:rFonts w:ascii="Calibri" w:eastAsia="Times New Roman" w:hAnsi="Calibri" w:cs="Calibri"/>
@@ -4091,6 +4357,7 @@
               </w:rPr>
               <w:t>Fronleichman</w:t>
             </w:r>
+            <w:proofErr w:type="spellEnd"/>
           </w:p>
         </w:tc>
         <w:tc>
@@ -4157,6 +4424,7 @@
                 <w14:ligatures w14:val="none"/>
               </w:rPr>
             </w:pPr>
+            <w:proofErr w:type="spellStart"/>
             <w:r>
               <w:rPr>
                 <w:rFonts w:ascii="Calibri" w:eastAsia="Times New Roman" w:hAnsi="Calibri" w:cs="Calibri"/>
@@ -4169,6 +4437,7 @@
               </w:rPr>
               <w:t>Fronleichman</w:t>
             </w:r>
+            <w:proofErr w:type="spellEnd"/>
           </w:p>
         </w:tc>
         <w:tc>
@@ -4235,6 +4504,7 @@
                 <w14:ligatures w14:val="none"/>
               </w:rPr>
             </w:pPr>
+            <w:proofErr w:type="spellStart"/>
             <w:r>
               <w:rPr>
                 <w:rFonts w:ascii="Calibri" w:eastAsia="Times New Roman" w:hAnsi="Calibri" w:cs="Calibri"/>
@@ -4247,6 +4517,7 @@
               </w:rPr>
               <w:t>Fronleichman</w:t>
             </w:r>
+            <w:proofErr w:type="spellEnd"/>
           </w:p>
         </w:tc>
         <w:tc>

</xml_diff>

<commit_message>
feat: Kurze Notiz hinzugefügt
Notiz Hinzugefügt zum Plan:

Server.js ändern bevor Hosten!

Zoe macht ebenfalls überall Kommentare wo wir es ändern müssten.

Luka
</commit_message>
<xml_diff>
--- a/Dokumentation/Projektplanung LV, ZB, KH.docx
+++ b/Dokumentation/Projektplanung LV, ZB, KH.docx
@@ -18,27 +18,7 @@
           <w:sz w:val="28"/>
           <w:szCs w:val="28"/>
         </w:rPr>
-        <w:t xml:space="preserve">Projektplanung </w:t>
-      </w:r>
-      <w:proofErr w:type="spellStart"/>
-      <w:r>
-        <w:rPr>
-          <w:b/>
-          <w:bCs/>
-          <w:sz w:val="28"/>
-          <w:szCs w:val="28"/>
-        </w:rPr>
-        <w:t>Voyagediary</w:t>
-      </w:r>
-      <w:proofErr w:type="spellEnd"/>
-      <w:r>
-        <w:rPr>
-          <w:b/>
-          <w:bCs/>
-          <w:sz w:val="28"/>
-          <w:szCs w:val="28"/>
-        </w:rPr>
-        <w:t xml:space="preserve"> </w:t>
+        <w:t xml:space="preserve">Projektplanung Voyagediary </w:t>
       </w:r>
     </w:p>
     <w:p>
@@ -77,46 +57,17 @@
       <w:r>
         <w:t xml:space="preserve">Die </w:t>
       </w:r>
-      <w:proofErr w:type="spellStart"/>
       <w:r>
-        <w:t>Social</w:t>
-      </w:r>
-      <w:proofErr w:type="spellEnd"/>
-      <w:r>
-        <w:t xml:space="preserve"> Media Plattform</w:t>
+        <w:t>Social Media Plattform</w:t>
       </w:r>
       <w:r>
-        <w:t xml:space="preserve"> «</w:t>
-      </w:r>
-      <w:proofErr w:type="spellStart"/>
-      <w:r>
-        <w:t>Voyagediary</w:t>
-      </w:r>
-      <w:proofErr w:type="spellEnd"/>
-      <w:r>
-        <w:t xml:space="preserve">» </w:t>
+        <w:t xml:space="preserve"> «Voyagediary» </w:t>
       </w:r>
       <w:r>
-        <w:t xml:space="preserve">soll eine Seite werden für </w:t>
-      </w:r>
-      <w:proofErr w:type="spellStart"/>
-      <w:r>
-        <w:t>Reiseinterresierte</w:t>
-      </w:r>
-      <w:proofErr w:type="spellEnd"/>
-      <w:r>
-        <w:t xml:space="preserve">, auch bekannt als «Nomaden», </w:t>
+        <w:t xml:space="preserve">soll eine Seite werden für Reiseinterresierte, auch bekannt als «Nomaden», </w:t>
       </w:r>
       <w:r>
-        <w:t xml:space="preserve">über deren Reise berichten können und von deren </w:t>
-      </w:r>
-      <w:proofErr w:type="gramStart"/>
-      <w:r>
-        <w:t>anderer Betrachten</w:t>
-      </w:r>
-      <w:proofErr w:type="gramEnd"/>
-      <w:r>
-        <w:t xml:space="preserve"> und sich informieren können.</w:t>
+        <w:t>über deren Reise berichten können und von deren anderer Betrachten und sich informieren können.</w:t>
       </w:r>
     </w:p>
     <w:p/>
@@ -1034,22 +985,8 @@
                 <w:lang w:eastAsia="de-CH"/>
                 <w14:ligatures w14:val="none"/>
               </w:rPr>
-              <w:t xml:space="preserve">ERM und ERD + </w:t>
-            </w:r>
-            <w:proofErr w:type="spellStart"/>
-            <w:r>
-              <w:rPr>
-                <w:rFonts w:ascii="Calibri" w:eastAsia="Times New Roman" w:hAnsi="Calibri" w:cs="Calibri"/>
-                <w:color w:val="000000"/>
-                <w:kern w:val="0"/>
-                <w:sz w:val="22"/>
-                <w:szCs w:val="22"/>
-                <w:lang w:eastAsia="de-CH"/>
-                <w14:ligatures w14:val="none"/>
-              </w:rPr>
-              <w:t>Github</w:t>
-            </w:r>
-            <w:proofErr w:type="spellEnd"/>
+              <w:t>ERM und ERD + Github</w:t>
+            </w:r>
           </w:p>
         </w:tc>
         <w:tc>
@@ -1194,31 +1131,17 @@
                 <w14:ligatures w14:val="none"/>
               </w:rPr>
             </w:pPr>
-            <w:proofErr w:type="spellStart"/>
-            <w:r>
-              <w:rPr>
-                <w:rFonts w:ascii="Calibri" w:eastAsia="Times New Roman" w:hAnsi="Calibri" w:cs="Calibri"/>
-                <w:color w:val="000000"/>
-                <w:kern w:val="0"/>
-                <w:sz w:val="22"/>
-                <w:szCs w:val="22"/>
-                <w:lang w:eastAsia="de-CH"/>
-                <w14:ligatures w14:val="none"/>
-              </w:rPr>
-              <w:t>Informiten</w:t>
-            </w:r>
-            <w:proofErr w:type="spellEnd"/>
-            <w:r>
-              <w:rPr>
-                <w:rFonts w:ascii="Calibri" w:eastAsia="Times New Roman" w:hAnsi="Calibri" w:cs="Calibri"/>
-                <w:color w:val="000000"/>
-                <w:kern w:val="0"/>
-                <w:sz w:val="22"/>
-                <w:szCs w:val="22"/>
-                <w:lang w:eastAsia="de-CH"/>
-                <w14:ligatures w14:val="none"/>
-              </w:rPr>
-              <w:t xml:space="preserve"> und Testen</w:t>
+            <w:r>
+              <w:rPr>
+                <w:rFonts w:ascii="Calibri" w:eastAsia="Times New Roman" w:hAnsi="Calibri" w:cs="Calibri"/>
+                <w:color w:val="000000"/>
+                <w:kern w:val="0"/>
+                <w:sz w:val="22"/>
+                <w:szCs w:val="22"/>
+                <w:lang w:eastAsia="de-CH"/>
+                <w14:ligatures w14:val="none"/>
+              </w:rPr>
+              <w:t>Informiten und Testen</w:t>
             </w:r>
           </w:p>
         </w:tc>
@@ -1342,33 +1265,7 @@
                 <w:lang w:eastAsia="de-CH"/>
                 <w14:ligatures w14:val="none"/>
               </w:rPr>
-              <w:t xml:space="preserve">Create </w:t>
-            </w:r>
-            <w:proofErr w:type="spellStart"/>
-            <w:r>
-              <w:rPr>
-                <w:rFonts w:ascii="Calibri" w:eastAsia="Times New Roman" w:hAnsi="Calibri" w:cs="Calibri"/>
-                <w:color w:val="000000"/>
-                <w:kern w:val="0"/>
-                <w:sz w:val="22"/>
-                <w:szCs w:val="22"/>
-                <w:lang w:eastAsia="de-CH"/>
-                <w14:ligatures w14:val="none"/>
-              </w:rPr>
-              <w:t>Tabels</w:t>
-            </w:r>
-            <w:proofErr w:type="spellEnd"/>
-            <w:r>
-              <w:rPr>
-                <w:rFonts w:ascii="Calibri" w:eastAsia="Times New Roman" w:hAnsi="Calibri" w:cs="Calibri"/>
-                <w:color w:val="000000"/>
-                <w:kern w:val="0"/>
-                <w:sz w:val="22"/>
-                <w:szCs w:val="22"/>
-                <w:lang w:eastAsia="de-CH"/>
-                <w14:ligatures w14:val="none"/>
-              </w:rPr>
-              <w:t xml:space="preserve"> und Docker Container</w:t>
+              <w:t>Create Tabels und Docker Container</w:t>
             </w:r>
           </w:p>
         </w:tc>
@@ -1514,57 +1411,17 @@
                 <w14:ligatures w14:val="none"/>
               </w:rPr>
             </w:pPr>
-            <w:proofErr w:type="spellStart"/>
-            <w:r>
-              <w:rPr>
-                <w:rFonts w:ascii="Calibri" w:eastAsia="Times New Roman" w:hAnsi="Calibri" w:cs="Calibri"/>
-                <w:color w:val="000000"/>
-                <w:kern w:val="0"/>
-                <w:sz w:val="22"/>
-                <w:szCs w:val="22"/>
-                <w:lang w:eastAsia="de-CH"/>
-                <w14:ligatures w14:val="none"/>
-              </w:rPr>
-              <w:t>Übersezung</w:t>
-            </w:r>
-            <w:proofErr w:type="spellEnd"/>
-            <w:r>
-              <w:rPr>
-                <w:rFonts w:ascii="Calibri" w:eastAsia="Times New Roman" w:hAnsi="Calibri" w:cs="Calibri"/>
-                <w:color w:val="000000"/>
-                <w:kern w:val="0"/>
-                <w:sz w:val="22"/>
-                <w:szCs w:val="22"/>
-                <w:lang w:eastAsia="de-CH"/>
-                <w14:ligatures w14:val="none"/>
-              </w:rPr>
-              <w:t xml:space="preserve"> für Start Seite </w:t>
-            </w:r>
-            <w:proofErr w:type="spellStart"/>
-            <w:r>
-              <w:rPr>
-                <w:rFonts w:ascii="Calibri" w:eastAsia="Times New Roman" w:hAnsi="Calibri" w:cs="Calibri"/>
-                <w:color w:val="000000"/>
-                <w:kern w:val="0"/>
-                <w:sz w:val="22"/>
-                <w:szCs w:val="22"/>
-                <w:lang w:eastAsia="de-CH"/>
-                <w14:ligatures w14:val="none"/>
-              </w:rPr>
-              <w:t>implementiren</w:t>
-            </w:r>
-            <w:proofErr w:type="spellEnd"/>
-            <w:r>
-              <w:rPr>
-                <w:rFonts w:ascii="Calibri" w:eastAsia="Times New Roman" w:hAnsi="Calibri" w:cs="Calibri"/>
-                <w:color w:val="000000"/>
-                <w:kern w:val="0"/>
-                <w:sz w:val="22"/>
-                <w:szCs w:val="22"/>
-                <w:lang w:eastAsia="de-CH"/>
-                <w14:ligatures w14:val="none"/>
-              </w:rPr>
-              <w:t xml:space="preserve"> </w:t>
+            <w:r>
+              <w:rPr>
+                <w:rFonts w:ascii="Calibri" w:eastAsia="Times New Roman" w:hAnsi="Calibri" w:cs="Calibri"/>
+                <w:color w:val="000000"/>
+                <w:kern w:val="0"/>
+                <w:sz w:val="22"/>
+                <w:szCs w:val="22"/>
+                <w:lang w:eastAsia="de-CH"/>
+                <w14:ligatures w14:val="none"/>
+              </w:rPr>
+              <w:t xml:space="preserve">Übersezung für Start Seite implementiren </w:t>
             </w:r>
           </w:p>
         </w:tc>
@@ -1678,83 +1535,17 @@
                 <w14:ligatures w14:val="none"/>
               </w:rPr>
             </w:pPr>
-            <w:proofErr w:type="spellStart"/>
-            <w:r>
-              <w:rPr>
-                <w:rFonts w:ascii="Calibri" w:eastAsia="Times New Roman" w:hAnsi="Calibri" w:cs="Calibri"/>
-                <w:color w:val="000000"/>
-                <w:kern w:val="0"/>
-                <w:sz w:val="22"/>
-                <w:szCs w:val="22"/>
-                <w:lang w:eastAsia="de-CH"/>
-                <w14:ligatures w14:val="none"/>
-              </w:rPr>
-              <w:t>evt.</w:t>
-            </w:r>
-            <w:proofErr w:type="spellEnd"/>
-            <w:r>
-              <w:rPr>
-                <w:rFonts w:ascii="Calibri" w:eastAsia="Times New Roman" w:hAnsi="Calibri" w:cs="Calibri"/>
-                <w:color w:val="000000"/>
-                <w:kern w:val="0"/>
-                <w:sz w:val="22"/>
-                <w:szCs w:val="22"/>
-                <w:lang w:eastAsia="de-CH"/>
-                <w14:ligatures w14:val="none"/>
-              </w:rPr>
-              <w:t xml:space="preserve"> User </w:t>
-            </w:r>
-            <w:proofErr w:type="spellStart"/>
-            <w:r>
-              <w:rPr>
-                <w:rFonts w:ascii="Calibri" w:eastAsia="Times New Roman" w:hAnsi="Calibri" w:cs="Calibri"/>
-                <w:color w:val="000000"/>
-                <w:kern w:val="0"/>
-                <w:sz w:val="22"/>
-                <w:szCs w:val="22"/>
-                <w:lang w:eastAsia="de-CH"/>
-                <w14:ligatures w14:val="none"/>
-              </w:rPr>
-              <w:t>define</w:t>
-            </w:r>
-            <w:proofErr w:type="spellEnd"/>
-            <w:r>
-              <w:rPr>
-                <w:rFonts w:ascii="Calibri" w:eastAsia="Times New Roman" w:hAnsi="Calibri" w:cs="Calibri"/>
-                <w:color w:val="000000"/>
-                <w:kern w:val="0"/>
-                <w:sz w:val="22"/>
-                <w:szCs w:val="22"/>
-                <w:lang w:eastAsia="de-CH"/>
-                <w14:ligatures w14:val="none"/>
-              </w:rPr>
-              <w:t xml:space="preserve"> </w:t>
-            </w:r>
-            <w:proofErr w:type="spellStart"/>
-            <w:r>
-              <w:rPr>
-                <w:rFonts w:ascii="Calibri" w:eastAsia="Times New Roman" w:hAnsi="Calibri" w:cs="Calibri"/>
-                <w:color w:val="000000"/>
-                <w:kern w:val="0"/>
-                <w:sz w:val="22"/>
-                <w:szCs w:val="22"/>
-                <w:lang w:eastAsia="de-CH"/>
-                <w14:ligatures w14:val="none"/>
-              </w:rPr>
-              <w:t>functions</w:t>
-            </w:r>
-            <w:proofErr w:type="spellEnd"/>
-            <w:r>
-              <w:rPr>
-                <w:rFonts w:ascii="Calibri" w:eastAsia="Times New Roman" w:hAnsi="Calibri" w:cs="Calibri"/>
-                <w:color w:val="000000"/>
-                <w:kern w:val="0"/>
-                <w:sz w:val="22"/>
-                <w:szCs w:val="22"/>
-                <w:lang w:eastAsia="de-CH"/>
-                <w14:ligatures w14:val="none"/>
-              </w:rPr>
-              <w:t xml:space="preserve"> oder </w:t>
+            <w:r>
+              <w:rPr>
+                <w:rFonts w:ascii="Calibri" w:eastAsia="Times New Roman" w:hAnsi="Calibri" w:cs="Calibri"/>
+                <w:color w:val="000000"/>
+                <w:kern w:val="0"/>
+                <w:sz w:val="22"/>
+                <w:szCs w:val="22"/>
+                <w:lang w:eastAsia="de-CH"/>
+                <w14:ligatures w14:val="none"/>
+              </w:rPr>
+              <w:t xml:space="preserve">evt. User define functions oder </w:t>
             </w:r>
           </w:p>
         </w:tc>
@@ -1832,22 +1623,8 @@
                 <w:lang w:eastAsia="de-CH"/>
                 <w14:ligatures w14:val="none"/>
               </w:rPr>
-              <w:t xml:space="preserve">Login/out , Profil, </w:t>
-            </w:r>
-            <w:proofErr w:type="spellStart"/>
-            <w:r>
-              <w:rPr>
-                <w:rFonts w:ascii="Calibri" w:eastAsia="Times New Roman" w:hAnsi="Calibri" w:cs="Calibri"/>
-                <w:color w:val="000000"/>
-                <w:kern w:val="0"/>
-                <w:sz w:val="22"/>
-                <w:szCs w:val="22"/>
-                <w:lang w:eastAsia="de-CH"/>
-                <w14:ligatures w14:val="none"/>
-              </w:rPr>
-              <w:t>beitrag</w:t>
-            </w:r>
-            <w:proofErr w:type="spellEnd"/>
+              <w:t>Login/out , Profil, beitrag</w:t>
+            </w:r>
           </w:p>
         </w:tc>
         <w:tc>
@@ -1914,46 +1691,18 @@
                 <w14:ligatures w14:val="none"/>
               </w:rPr>
             </w:pPr>
-            <w:proofErr w:type="spellStart"/>
-            <w:r>
-              <w:rPr>
-                <w:rFonts w:ascii="Calibri" w:eastAsia="Times New Roman" w:hAnsi="Calibri" w:cs="Calibri"/>
-                <w:color w:val="000000"/>
-                <w:kern w:val="0"/>
-                <w:sz w:val="22"/>
-                <w:szCs w:val="22"/>
-                <w:lang w:eastAsia="de-CH"/>
-                <w14:ligatures w14:val="none"/>
-              </w:rPr>
-              <w:t>Js</w:t>
-            </w:r>
-            <w:proofErr w:type="spellEnd"/>
-            <w:r>
-              <w:rPr>
-                <w:rFonts w:ascii="Calibri" w:eastAsia="Times New Roman" w:hAnsi="Calibri" w:cs="Calibri"/>
-                <w:color w:val="000000"/>
-                <w:kern w:val="0"/>
-                <w:sz w:val="22"/>
-                <w:szCs w:val="22"/>
-                <w:lang w:eastAsia="de-CH"/>
-                <w14:ligatures w14:val="none"/>
-              </w:rPr>
-              <w:t xml:space="preserve"> Logik </w:t>
-            </w:r>
-            <w:proofErr w:type="spellStart"/>
-            <w:r>
-              <w:rPr>
-                <w:rFonts w:ascii="Calibri" w:eastAsia="Times New Roman" w:hAnsi="Calibri" w:cs="Calibri"/>
-                <w:color w:val="000000"/>
-                <w:kern w:val="0"/>
-                <w:sz w:val="22"/>
-                <w:szCs w:val="22"/>
-                <w:lang w:eastAsia="de-CH"/>
-                <w14:ligatures w14:val="none"/>
-              </w:rPr>
-              <w:t>login</w:t>
-            </w:r>
-            <w:proofErr w:type="spellEnd"/>
+            <w:r>
+              <w:rPr>
+                <w:rFonts w:ascii="Calibri" w:eastAsia="Times New Roman" w:hAnsi="Calibri" w:cs="Calibri"/>
+                <w:color w:val="000000"/>
+                <w:kern w:val="0"/>
+                <w:sz w:val="22"/>
+                <w:szCs w:val="22"/>
+                <w:lang w:eastAsia="de-CH"/>
+                <w14:ligatures w14:val="none"/>
+              </w:rPr>
+              <w:t>Js Logik login</w:t>
+            </w:r>
           </w:p>
         </w:tc>
         <w:tc>
@@ -3062,31 +2811,17 @@
                 <w14:ligatures w14:val="none"/>
               </w:rPr>
             </w:pPr>
-            <w:proofErr w:type="spellStart"/>
-            <w:r>
-              <w:rPr>
-                <w:rFonts w:ascii="Calibri" w:eastAsia="Times New Roman" w:hAnsi="Calibri" w:cs="Calibri"/>
-                <w:color w:val="000000"/>
-                <w:kern w:val="0"/>
-                <w:sz w:val="22"/>
-                <w:szCs w:val="22"/>
-                <w:lang w:eastAsia="de-CH"/>
-                <w14:ligatures w14:val="none"/>
-              </w:rPr>
-              <w:t>Js</w:t>
-            </w:r>
-            <w:proofErr w:type="spellEnd"/>
-            <w:r>
-              <w:rPr>
-                <w:rFonts w:ascii="Calibri" w:eastAsia="Times New Roman" w:hAnsi="Calibri" w:cs="Calibri"/>
-                <w:color w:val="000000"/>
-                <w:kern w:val="0"/>
-                <w:sz w:val="22"/>
-                <w:szCs w:val="22"/>
-                <w:lang w:eastAsia="de-CH"/>
-                <w14:ligatures w14:val="none"/>
-              </w:rPr>
-              <w:t xml:space="preserve"> Logik Filter, suchleiste, etc.</w:t>
+            <w:r>
+              <w:rPr>
+                <w:rFonts w:ascii="Calibri" w:eastAsia="Times New Roman" w:hAnsi="Calibri" w:cs="Calibri"/>
+                <w:color w:val="000000"/>
+                <w:kern w:val="0"/>
+                <w:sz w:val="22"/>
+                <w:szCs w:val="22"/>
+                <w:lang w:eastAsia="de-CH"/>
+                <w14:ligatures w14:val="none"/>
+              </w:rPr>
+              <w:t>Js Logik Filter, suchleiste, etc.</w:t>
             </w:r>
           </w:p>
         </w:tc>
@@ -4344,7 +4079,6 @@
                 <w14:ligatures w14:val="none"/>
               </w:rPr>
             </w:pPr>
-            <w:proofErr w:type="spellStart"/>
             <w:r>
               <w:rPr>
                 <w:rFonts w:ascii="Calibri" w:eastAsia="Times New Roman" w:hAnsi="Calibri" w:cs="Calibri"/>
@@ -4357,7 +4091,6 @@
               </w:rPr>
               <w:t>Fronleichman</w:t>
             </w:r>
-            <w:proofErr w:type="spellEnd"/>
           </w:p>
         </w:tc>
         <w:tc>
@@ -4424,7 +4157,6 @@
                 <w14:ligatures w14:val="none"/>
               </w:rPr>
             </w:pPr>
-            <w:proofErr w:type="spellStart"/>
             <w:r>
               <w:rPr>
                 <w:rFonts w:ascii="Calibri" w:eastAsia="Times New Roman" w:hAnsi="Calibri" w:cs="Calibri"/>
@@ -4437,7 +4169,6 @@
               </w:rPr>
               <w:t>Fronleichman</w:t>
             </w:r>
-            <w:proofErr w:type="spellEnd"/>
           </w:p>
         </w:tc>
         <w:tc>
@@ -4504,7 +4235,6 @@
                 <w14:ligatures w14:val="none"/>
               </w:rPr>
             </w:pPr>
-            <w:proofErr w:type="spellStart"/>
             <w:r>
               <w:rPr>
                 <w:rFonts w:ascii="Calibri" w:eastAsia="Times New Roman" w:hAnsi="Calibri" w:cs="Calibri"/>
@@ -4517,7 +4247,6 @@
               </w:rPr>
               <w:t>Fronleichman</w:t>
             </w:r>
-            <w:proofErr w:type="spellEnd"/>
           </w:p>
         </w:tc>
         <w:tc>
@@ -4842,6 +4571,11 @@
       </w:tr>
     </w:tbl>
     <w:p/>
+    <w:p>
+      <w:r>
+        <w:t>Notiz: Server.js Ändern bevor Hosten!</w:t>
+      </w:r>
+    </w:p>
     <w:sectPr>
       <w:pgSz w:w="11906" w:h="16838"/>
       <w:pgMar w:top="1134" w:right="1134" w:bottom="1134" w:left="1134" w:header="708" w:footer="708" w:gutter="0"/>

</xml_diff>